<commit_message>
Case study image was reformed
</commit_message>
<xml_diff>
--- a/A Dust Hazard Index Using AOD-Based Frequency, Intensity, and Continuity of Dust Storm Events in the Tigris-Euphrates Bain.docx
+++ b/A Dust Hazard Index Using AOD-Based Frequency, Intensity, and Continuity of Dust Storm Events in the Tigris-Euphrates Bain.docx
@@ -2351,15 +2351,14 @@
       </w:pPr>
       <w:r>
         <w:rPr>
-          <w:rFonts w:asciiTheme="majorBidi" w:hAnsiTheme="majorBidi" w:cstheme="majorBidi"/>
           <w:noProof/>
         </w:rPr>
         <w:lastRenderedPageBreak/>
         <w:drawing>
-          <wp:inline distT="0" distB="0" distL="0" distR="0" wp14:anchorId="5B8087BC" wp14:editId="6C493914">
+          <wp:inline distT="0" distB="0" distL="0" distR="0" wp14:anchorId="2377A236" wp14:editId="6ACFF035">
             <wp:extent cx="5943600" cy="5209540"/>
             <wp:effectExtent l="0" t="0" r="0" b="0"/>
-            <wp:docPr id="167743807" name="Picture 1"/>
+            <wp:docPr id="2028843022" name="Picture 2"/>
             <wp:cNvGraphicFramePr>
               <a:graphicFrameLocks xmlns:a="http://schemas.openxmlformats.org/drawingml/2006/main" noChangeAspect="1"/>
             </wp:cNvGraphicFramePr>
@@ -2367,7 +2366,7 @@
               <a:graphicData uri="http://schemas.openxmlformats.org/drawingml/2006/picture">
                 <pic:pic xmlns:pic="http://schemas.openxmlformats.org/drawingml/2006/picture">
                   <pic:nvPicPr>
-                    <pic:cNvPr id="0" name="Picture 6"/>
+                    <pic:cNvPr id="0" name="Picture 8"/>
                     <pic:cNvPicPr>
                       <a:picLocks noChangeAspect="1" noChangeArrowheads="1"/>
                     </pic:cNvPicPr>
@@ -5156,10 +5155,10 @@
                   <v:path o:extrusionok="f" gradientshapeok="t" o:connecttype="rect"/>
                   <o:lock v:ext="edit" aspectratio="t"/>
                 </v:shapetype>
-                <v:shape id="_x0000_i1025" type="#_x0000_t75" style="width:136.65pt;height:43.65pt" o:ole="">
+                <v:shape id="_x0000_i1025" type="#_x0000_t75" style="width:136.5pt;height:43.5pt" o:ole="">
                   <v:imagedata r:id="rId14" o:title=""/>
                 </v:shape>
-                <o:OLEObject Type="Embed" ProgID="Equation.DSMT4" ShapeID="_x0000_i1025" DrawAspect="Content" ObjectID="_1839097546" r:id="rId15"/>
+                <o:OLEObject Type="Embed" ProgID="Equation.DSMT4" ShapeID="_x0000_i1025" DrawAspect="Content" ObjectID="_1839169899" r:id="rId15"/>
               </w:object>
             </w:r>
           </w:p>
@@ -5419,10 +5418,10 @@
           <w:szCs w:val="24"/>
         </w:rPr>
         <w:object w:dxaOrig="3739" w:dyaOrig="700" w14:anchorId="392D8F1E">
-          <v:shape id="_x0000_i1026" type="#_x0000_t75" style="width:187.65pt;height:36.3pt" o:ole="">
+          <v:shape id="_x0000_i1026" type="#_x0000_t75" style="width:187.5pt;height:36pt" o:ole="">
             <v:imagedata r:id="rId16" o:title=""/>
           </v:shape>
-          <o:OLEObject Type="Embed" ProgID="Equation.DSMT4" ShapeID="_x0000_i1026" DrawAspect="Content" ObjectID="_1839097547" r:id="rId17"/>
+          <o:OLEObject Type="Embed" ProgID="Equation.DSMT4" ShapeID="_x0000_i1026" DrawAspect="Content" ObjectID="_1839169900" r:id="rId17"/>
         </w:object>
       </w:r>
       <w:r>
@@ -12285,10 +12284,10 @@
           <w:szCs w:val="24"/>
         </w:rPr>
         <w:object w:dxaOrig="1500" w:dyaOrig="660" w14:anchorId="72894A18">
-          <v:shape id="_x0000_i1027" type="#_x0000_t75" style="width:93.55pt;height:36.3pt" o:ole="">
+          <v:shape id="_x0000_i1027" type="#_x0000_t75" style="width:93.75pt;height:36pt" o:ole="">
             <v:imagedata r:id="rId41" o:title=""/>
           </v:shape>
-          <o:OLEObject Type="Embed" ProgID="Equation.DSMT4" ShapeID="_x0000_i1027" DrawAspect="Content" ObjectID="_1839097548" r:id="rId42"/>
+          <o:OLEObject Type="Embed" ProgID="Equation.DSMT4" ShapeID="_x0000_i1027" DrawAspect="Content" ObjectID="_1839169901" r:id="rId42"/>
         </w:object>
       </w:r>
       <w:r>
@@ -12350,10 +12349,10 @@
           <w:szCs w:val="24"/>
         </w:rPr>
         <w:object w:dxaOrig="220" w:dyaOrig="279" w14:anchorId="17EC651F">
-          <v:shape id="_x0000_i1028" type="#_x0000_t75" style="width:7.35pt;height:14.15pt" o:ole="">
+          <v:shape id="_x0000_i1028" type="#_x0000_t75" style="width:7.5pt;height:14.25pt" o:ole="">
             <v:imagedata r:id="rId43" o:title=""/>
           </v:shape>
-          <o:OLEObject Type="Embed" ProgID="Equation.DSMT4" ShapeID="_x0000_i1028" DrawAspect="Content" ObjectID="_1839097549" r:id="rId44"/>
+          <o:OLEObject Type="Embed" ProgID="Equation.DSMT4" ShapeID="_x0000_i1028" DrawAspect="Content" ObjectID="_1839169902" r:id="rId44"/>
         </w:object>
       </w:r>
       <w:r>
@@ -12372,10 +12371,10 @@
           <w:szCs w:val="24"/>
         </w:rPr>
         <w:object w:dxaOrig="220" w:dyaOrig="279" w14:anchorId="62F0070A">
-          <v:shape id="_x0000_i1029" type="#_x0000_t75" style="width:7.35pt;height:14.15pt" o:ole="">
+          <v:shape id="_x0000_i1029" type="#_x0000_t75" style="width:7.5pt;height:14.25pt" o:ole="">
             <v:imagedata r:id="rId45" o:title=""/>
           </v:shape>
-          <o:OLEObject Type="Embed" ProgID="Equation.DSMT4" ShapeID="_x0000_i1029" DrawAspect="Content" ObjectID="_1839097550" r:id="rId46"/>
+          <o:OLEObject Type="Embed" ProgID="Equation.DSMT4" ShapeID="_x0000_i1029" DrawAspect="Content" ObjectID="_1839169903" r:id="rId46"/>
         </w:object>
       </w:r>
     </w:p>
@@ -13136,7 +13135,7 @@
                 <w:szCs w:val="20"/>
               </w:rPr>
               <w:drawing>
-                <wp:inline distT="0" distB="0" distL="0" distR="0" wp14:anchorId="3884CCFE" wp14:editId="56F1DC88">
+                <wp:inline distT="0" distB="0" distL="0" distR="0" wp14:anchorId="3884CCFE" wp14:editId="74F7DA30">
                   <wp:extent cx="2855344" cy="1537001"/>
                   <wp:effectExtent l="0" t="0" r="2540" b="6350"/>
                   <wp:docPr id="2" name="Picture 2"/>
@@ -13319,7 +13318,7 @@
                 <w:szCs w:val="20"/>
               </w:rPr>
               <w:drawing>
-                <wp:inline distT="0" distB="0" distL="0" distR="0" wp14:anchorId="29D05C59" wp14:editId="26F66E4A">
+                <wp:inline distT="0" distB="0" distL="0" distR="0" wp14:anchorId="29D05C59" wp14:editId="1E31BBA1">
                   <wp:extent cx="3206261" cy="1648672"/>
                   <wp:effectExtent l="0" t="0" r="0" b="8890"/>
                   <wp:docPr id="35" name="Picture 35"/>
@@ -13392,7 +13391,7 @@
                 <w:szCs w:val="20"/>
               </w:rPr>
               <w:drawing>
-                <wp:inline distT="0" distB="0" distL="0" distR="0" wp14:anchorId="1FEDFBAE" wp14:editId="752EFEEB">
+                <wp:inline distT="0" distB="0" distL="0" distR="0" wp14:anchorId="1FEDFBAE" wp14:editId="0384F182">
                   <wp:extent cx="3042878" cy="1625001"/>
                   <wp:effectExtent l="0" t="0" r="5715" b="0"/>
                   <wp:docPr id="34" name="Picture 34"/>
@@ -13589,7 +13588,7 @@
                 <w:szCs w:val="20"/>
               </w:rPr>
               <w:drawing>
-                <wp:inline distT="0" distB="0" distL="0" distR="0" wp14:anchorId="46118CD9" wp14:editId="736B447A">
+                <wp:inline distT="0" distB="0" distL="0" distR="0" wp14:anchorId="46118CD9" wp14:editId="67780C83">
                   <wp:extent cx="3138465" cy="1552755"/>
                   <wp:effectExtent l="0" t="0" r="5080" b="9525"/>
                   <wp:docPr id="31" name="Picture 31"/>
@@ -13666,7 +13665,7 @@
                 <w:szCs w:val="20"/>
               </w:rPr>
               <w:drawing>
-                <wp:inline distT="0" distB="0" distL="0" distR="0" wp14:anchorId="208B033F" wp14:editId="58A95694">
+                <wp:inline distT="0" distB="0" distL="0" distR="0" wp14:anchorId="208B033F" wp14:editId="40611539">
                   <wp:extent cx="2902172" cy="1544128"/>
                   <wp:effectExtent l="0" t="0" r="0" b="0"/>
                   <wp:docPr id="37" name="Picture 37"/>
@@ -13880,15 +13879,7 @@
           <w:sz w:val="24"/>
           <w:szCs w:val="24"/>
         </w:rPr>
-        <w:t xml:space="preserve"> </w:t>
-      </w:r>
-      <w:r>
-        <w:rPr>
-          <w:rFonts w:asciiTheme="majorBidi" w:hAnsiTheme="majorBidi" w:cstheme="majorBidi"/>
-          <w:sz w:val="24"/>
-          <w:szCs w:val="24"/>
-        </w:rPr>
-        <w:t xml:space="preserve">indicated that annual DSE counts approximate a normal distribution for most cities. </w:t>
+        <w:t xml:space="preserve"> indicated that annual DSE counts approximate a normal distribution for most cities. </w:t>
       </w:r>
     </w:p>
     <w:p>
@@ -27191,6 +27182,7 @@
   <w:style w:type="character" w:default="1" w:styleId="DefaultParagraphFont">
     <w:name w:val="Default Paragraph Font"/>
     <w:uiPriority w:val="1"/>
+    <w:semiHidden/>
     <w:unhideWhenUsed/>
   </w:style>
   <w:style w:type="table" w:default="1" w:styleId="TableNormal">

</xml_diff>